<commit_message>
Data dictionary/table structure updated
</commit_message>
<xml_diff>
--- a/SkillBarter_Chapter2.docx
+++ b/SkillBarter_Chapter2.docx
@@ -3,151 +3,23 @@
 <w:document xmlns:wpc="http://schemas.microsoft.com/office/word/2010/wordprocessingCanvas" xmlns:cx="http://schemas.microsoft.com/office/drawing/2014/chartex" xmlns:cx1="http://schemas.microsoft.com/office/drawing/2015/9/8/chartex" xmlns:cx2="http://schemas.microsoft.com/office/drawing/2015/10/21/chartex" xmlns:cx3="http://schemas.microsoft.com/office/drawing/2016/5/9/chartex" xmlns:cx4="http://schemas.microsoft.com/office/drawing/2016/5/10/chartex" xmlns:cx5="http://schemas.microsoft.com/office/drawing/2016/5/11/chartex" xmlns:cx6="http://schemas.microsoft.com/office/drawing/2016/5/12/chartex" xmlns:cx7="http://schemas.microsoft.com/office/drawing/2016/5/13/chartex" xmlns:cx8="http://schemas.microsoft.com/office/drawing/2016/5/14/chartex" xmlns:mc="http://schemas.openxmlformats.org/markup-compatibility/2006" xmlns:aink="http://schemas.microsoft.com/office/drawing/2016/ink" xmlns:am3d="http://schemas.microsoft.com/office/drawing/2017/model3d" xmlns:o="urn:schemas-microsoft-com:office:office" xmlns:oel="http://schemas.microsoft.com/office/2019/extlst" xmlns:r="http://schemas.openxmlformats.org/officeDocument/2006/relationships" xmlns:m="http://schemas.openxmlformats.org/officeDocument/2006/math" xmlns:v="urn:schemas-microsoft-com:vml" xmlns:wp14="http://schemas.microsoft.com/office/word/2010/wordprocessingDrawing" xmlns:wp="http://schemas.openxmlformats.org/drawingml/2006/wordprocessingDrawing" xmlns:w10="urn:schemas-microsoft-com:office:word" xmlns:w="http://schemas.openxmlformats.org/wordprocessingml/2006/main" xmlns:w14="http://schemas.microsoft.com/office/word/2010/wordml" xmlns:w15="http://schemas.microsoft.com/office/word/2012/wordml" xmlns:w16cex="http://schemas.microsoft.com/office/word/2018/wordml/cex" xmlns:w16cid="http://schemas.microsoft.com/office/word/2016/wordml/cid" xmlns:w16="http://schemas.microsoft.com/office/word/2018/wordml" xmlns:w16du="http://schemas.microsoft.com/office/word/2023/wordml/word16du" xmlns:w16sdtdh="http://schemas.microsoft.com/office/word/2020/wordml/sdtdatahash" xmlns:w16sdtfl="http://schemas.microsoft.com/office/word/2024/wordml/sdtformatlock" xmlns:w16se="http://schemas.microsoft.com/office/word/2015/wordml/symex" xmlns:wpg="http://schemas.microsoft.com/office/word/2010/wordprocessingGroup" xmlns:wpi="http://schemas.microsoft.com/office/word/2010/wordprocessingInk" xmlns:wne="http://schemas.microsoft.com/office/word/2006/wordml" xmlns:wps="http://schemas.microsoft.com/office/word/2010/wordprocessingShape" mc:Ignorable="w14 w15 w16se w16cid w16 w16cex w16sdtdh w16sdtfl w16du wp14">
   <w:body>
     <w:p>
-      <w:pPr>
-        <w:spacing w:after="20"/>
-        <w:jc w:val="center"/>
-      </w:pPr>
-      <w:r>
-        <w:rPr>
-          <w:rFonts w:ascii="Times New Roman" w:hAnsi="Times New Roman"/>
-          <w:b/>
-          <w:sz w:val="26"/>
-        </w:rPr>
-        <w:t>Maharashtra Education Society's Institute of Management</w:t>
-      </w:r>
-    </w:p>
-    <w:p>
-      <w:pPr>
-        <w:spacing w:after="40"/>
-        <w:jc w:val="center"/>
-      </w:pPr>
-      <w:r>
-        <w:rPr>
-          <w:rFonts w:ascii="Times New Roman" w:hAnsi="Times New Roman"/>
-          <w:b/>
-          <w:sz w:val="26"/>
-        </w:rPr>
-        <w:t>and Career Courses (IMCC), Pune — AUTONOMOUS</w:t>
-      </w:r>
-    </w:p>
-    <w:p>
-      <w:pPr>
-        <w:spacing w:after="80"/>
-        <w:jc w:val="center"/>
-      </w:pPr>
-      <w:r>
-        <w:rPr>
-          <w:rFonts w:ascii="Times New Roman" w:hAnsi="Times New Roman"/>
-        </w:rPr>
-        <w:t>Department of Computer Applications (MCA) | FY MCA | Div A | Batch 26-28</w:t>
-      </w:r>
-    </w:p>
-    <w:p>
-      <w:pPr>
-        <w:pBdr>
-          <w:bottom w:val="single" w:sz="18" w:space="1" w:color="003366"/>
-        </w:pBdr>
-        <w:spacing w:before="40" w:after="160"/>
-      </w:pPr>
-    </w:p>
-    <w:p>
-      <w:pPr>
-        <w:spacing w:before="80" w:after="40"/>
-        <w:jc w:val="center"/>
-      </w:pPr>
-      <w:r>
-        <w:rPr>
-          <w:rFonts w:ascii="Times New Roman" w:hAnsi="Times New Roman"/>
-          <w:b/>
-          <w:sz w:val="30"/>
-        </w:rPr>
-        <w:t>Application Development Project</w:t>
-      </w:r>
-    </w:p>
-    <w:p>
-      <w:pPr>
-        <w:spacing w:before="40"/>
-        <w:jc w:val="center"/>
-      </w:pPr>
+      <w:proofErr w:type="gramStart"/>
       <w:r>
         <w:rPr>
           <w:rFonts w:ascii="Times New Roman" w:hAnsi="Times New Roman"/>
           <w:b/>
           <w:sz w:val="28"/>
         </w:rPr>
-        <w:t>SkillBarter: Peer-to-Peer Collaborative Knowledge Exchange Platform</w:t>
+        <w:t>2.1  Entity</w:t>
       </w:r>
-    </w:p>
-    <w:p>
-      <w:pPr>
-        <w:spacing w:before="120" w:after="120"/>
-        <w:jc w:val="center"/>
-      </w:pPr>
-      <w:r>
-        <w:rPr>
-          <w:rFonts w:ascii="Times New Roman" w:hAnsi="Times New Roman"/>
-          <w:b/>
-          <w:sz w:val="26"/>
-        </w:rPr>
-        <w:t>Chapter 2: Analysis and Design</w:t>
-      </w:r>
-    </w:p>
-    <w:p>
-      <w:pPr>
-        <w:spacing w:before="200" w:after="40"/>
-        <w:jc w:val="center"/>
-      </w:pPr>
-      <w:r>
-        <w:rPr>
-          <w:rFonts w:ascii="Times New Roman" w:hAnsi="Times New Roman"/>
-          <w:b/>
-          <w:sz w:val="24"/>
-        </w:rPr>
-        <w:t>Submitted by:</w:t>
-      </w:r>
-    </w:p>
-    <w:p>
-      <w:pPr>
-        <w:spacing w:before="40" w:after="40"/>
-        <w:jc w:val="center"/>
-      </w:pPr>
-      <w:r>
-        <w:rPr>
-          <w:rFonts w:ascii="Times New Roman" w:hAnsi="Times New Roman"/>
-          <w:sz w:val="24"/>
-        </w:rPr>
-        <w:t>Prasad D. Bairagi (2601008)  &amp;  Pranav S. Hasnale (2601074)</w:t>
-      </w:r>
-    </w:p>
-    <w:p>
-      <w:pPr>
-        <w:spacing w:before="40" w:after="80"/>
-        <w:jc w:val="center"/>
-      </w:pPr>
-      <w:r>
-        <w:rPr>
-          <w:rFonts w:ascii="Times New Roman" w:hAnsi="Times New Roman"/>
-        </w:rPr>
-        <w:t>Academic Year 2026-27</w:t>
-      </w:r>
-    </w:p>
-    <w:p>
-      <w:r>
-        <w:br w:type="page"/>
-      </w:r>
-    </w:p>
-    <w:p>
-      <w:pPr>
-        <w:spacing w:after="120"/>
-      </w:pPr>
+      <w:proofErr w:type="gramEnd"/>
       <w:r>
         <w:rPr>
           <w:rFonts w:ascii="Times New Roman" w:hAnsi="Times New Roman"/>
           <w:b/>
           <w:sz w:val="28"/>
         </w:rPr>
-        <w:lastRenderedPageBreak/>
-        <w:t>2.1  Entity Relationship Diagram (ERD)</w:t>
+        <w:t xml:space="preserve"> Relationship Diagram (ERD)</w:t>
       </w:r>
     </w:p>
     <w:p>
@@ -792,22 +664,23 @@
       </w:tr>
     </w:tbl>
     <w:p>
-      <w:r>
-        <w:br w:type="page"/>
-      </w:r>
-    </w:p>
-    <w:p>
-      <w:pPr>
-        <w:spacing w:after="120"/>
-      </w:pPr>
+      <w:proofErr w:type="gramStart"/>
       <w:r>
         <w:rPr>
           <w:rFonts w:ascii="Times New Roman" w:hAnsi="Times New Roman"/>
           <w:b/>
           <w:sz w:val="28"/>
         </w:rPr>
-        <w:lastRenderedPageBreak/>
-        <w:t>2.2  Business Use Case Diagram</w:t>
+        <w:t>2.2  Business</w:t>
+      </w:r>
+      <w:proofErr w:type="gramEnd"/>
+      <w:r>
+        <w:rPr>
+          <w:rFonts w:ascii="Times New Roman" w:hAnsi="Times New Roman"/>
+          <w:b/>
+          <w:sz w:val="28"/>
+        </w:rPr>
+        <w:t xml:space="preserve"> Use Case Diagram</w:t>
       </w:r>
     </w:p>
     <w:p>
@@ -2820,6 +2693,16 @@
     <w:p>
       <w:pPr>
         <w:spacing w:before="200" w:after="80"/>
+        <w:rPr>
+          <w:rFonts w:ascii="Times New Roman" w:hAnsi="Times New Roman"/>
+          <w:b/>
+          <w:sz w:val="24"/>
+        </w:rPr>
+      </w:pPr>
+    </w:p>
+    <w:p>
+      <w:pPr>
+        <w:spacing w:before="200" w:after="80"/>
       </w:pPr>
       <w:r>
         <w:rPr>
@@ -2827,6 +2710,7 @@
           <w:b/>
           <w:sz w:val="24"/>
         </w:rPr>
+        <w:lastRenderedPageBreak/>
         <w:t>Table 5: SESSION Collection</w:t>
       </w:r>
     </w:p>
@@ -2860,7 +2744,6 @@
                 <w:rFonts w:ascii="Times New Roman" w:hAnsi="Times New Roman"/>
                 <w:sz w:val="20"/>
               </w:rPr>
-              <w:lastRenderedPageBreak/>
               <w:t>Field Name</w:t>
             </w:r>
           </w:p>
@@ -4779,6 +4662,7 @@
                 <w:rFonts w:ascii="Times New Roman" w:hAnsi="Times New Roman"/>
                 <w:sz w:val="20"/>
               </w:rPr>
+              <w:lastRenderedPageBreak/>
               <w:t>Timestamp</w:t>
             </w:r>
           </w:p>
@@ -4846,7 +4730,6 @@
           <w:b/>
           <w:sz w:val="24"/>
         </w:rPr>
-        <w:lastRenderedPageBreak/>
         <w:t>Table 9: NOTIFICATION Collection</w:t>
       </w:r>
     </w:p>

</xml_diff>